<commit_message>
Added support for Else and ElseIf.  Added document preview test window
</commit_message>
<xml_diff>
--- a/templates/petition.docx
+++ b/templates/petition.docx
@@ -15,7 +15,7 @@
           <w:b/>
           <w:bCs/>
         </w:rPr>
-        <w:t>IN THE DISTRICT COURT OF THE FIRST JUDICIAL DISTRICT</w:t>
+        <w:t>[IF Jurisdiction = "Massachusetts"]IN THE UNITED STATES DISTRICT COURT FOR THE DISTRICT OF MASSACHUSETTS[ELSE IF Jurisdiction = "New Hampshire"]IN THE UNITED STATES DISTRICT COURT FOR THE DISTRICT OF NEW HAMPSHIRE[ELSE]IN THE UNITED STATES DISTRICT COURT FOR THE DISTRICT OF ________[END IF]</w:t>
       </w:r>
     </w:p>
     <w:p/>
@@ -313,55 +313,7 @@
         <w:spacing w:after="240"/>
       </w:pPr>
       <w:r>
-        <w:t xml:space="preserve">This action is brought pursuant to </w:t>
-      </w:r>
-      <w:r>
-        <w:t xml:space="preserve">[Jurisdiction] law.  </w:t>
-      </w:r>
-      <w:r>
-        <w:t xml:space="preserve">[IF </w:t>
-      </w:r>
-      <w:r>
-        <w:t>Jurisdiction = “</w:t>
-      </w:r>
-      <w:r>
-        <w:t>Massachusetts</w:t>
-      </w:r>
-      <w:r>
-        <w:t>”</w:t>
-      </w:r>
-      <w:r>
-        <w:t>]</w:t>
-      </w:r>
-      <w:r>
-        <w:t>See Mass. Gen. Laws ch. 260, § 2</w:t>
-      </w:r>
-      <w:r>
-        <w:t>[END IF][IF</w:t>
-      </w:r>
-      <w:r>
-        <w:t xml:space="preserve"> </w:t>
-      </w:r>
-      <w:r>
-        <w:t xml:space="preserve">Jurisdiction </w:t>
-      </w:r>
-      <w:r>
-        <w:t>=</w:t>
-      </w:r>
-      <w:r>
-        <w:t xml:space="preserve"> </w:t>
-      </w:r>
-      <w:r>
-        <w:t>“</w:t>
-      </w:r>
-      <w:r>
-        <w:t>New Hampshire</w:t>
-      </w:r>
-      <w:r>
-        <w:t>”</w:t>
-      </w:r>
-      <w:r>
-        <w:t>]See N.H. Rev. Stat. Ann. § 508:4.[END IF]</w:t>
+        <w:t>This action is brought pursuant to [Jurisdiction] law. [IF Jurisdiction = "Massachusetts"]See Mass. Gen. Laws ch. 260, § 2.[ELSE IF Jurisdiction = "New Hampshire"]See N.H. Rev. Stat. Ann. § 508:4.[ELSE]See applicable federal statutory provisions.[END IF]</w:t>
       </w:r>
     </w:p>
     <w:p>
@@ -369,28 +321,7 @@
         <w:spacing w:after="240"/>
       </w:pPr>
       <w:r>
-        <w:t xml:space="preserve">[IF </w:t>
-      </w:r>
-      <w:r>
-        <w:t>Type of Habeas Petition</w:t>
-      </w:r>
-      <w:r>
-        <w:t xml:space="preserve"> = “</w:t>
-      </w:r>
-      <w:r>
-        <w:t>G</w:t>
-      </w:r>
-      <w:r>
-        <w:t>O</w:t>
-      </w:r>
-      <w:r>
-        <w:t xml:space="preserve"> Class</w:t>
-      </w:r>
-      <w:r>
-        <w:t>”</w:t>
-      </w:r>
-      <w:r>
-        <w:t>]</w:t>
+        <w:t>[IF Type of Habeas Petition = "GO Class"]</w:t>
       </w:r>
     </w:p>
     <w:p>
@@ -412,6 +343,19 @@
       </w:pPr>
       <w:r>
         <w:t>[END IF]</w:t>
+      </w:r>
+    </w:p>
+    <w:p>
+      <w:pPr>
+        <w:pStyle w:val="ListParagraph"/>
+        <w:numPr>
+          <w:ilvl w:val="0"/>
+          <w:numId w:val="3"/>
+        </w:numPr>
+        <w:spacing w:after="240"/>
+      </w:pPr>
+      <w:r>
+        <w:t>[IF Type of Habeas Petition = "GO Class"]Plaintiff seeks class-wide declaratory and injunctive relief on behalf of all class members.[ELSE]Plaintiff seeks individual habeas corpus relief and an immediate bond hearing.[END IF]</w:t>
       </w:r>
     </w:p>
     <w:p>
@@ -1307,7 +1251,6 @@
   <w:style w:type="character" w:default="1" w:styleId="DefaultParagraphFont">
     <w:name w:val="Default Paragraph Font"/>
     <w:uiPriority w:val="1"/>
-    <w:semiHidden/>
     <w:unhideWhenUsed/>
   </w:style>
   <w:style w:type="table" w:default="1" w:styleId="TableNormal">

</xml_diff>

<commit_message>
Added support for ALL CAPS variables and added Word Automation guide for conditional text
</commit_message>
<xml_diff>
--- a/templates/petition.docx
+++ b/templates/petition.docx
@@ -15,7 +15,21 @@
           <w:b/>
           <w:bCs/>
         </w:rPr>
-        <w:t>[IF Jurisdiction = "Massachusetts"]IN THE UNITED STATES DISTRICT COURT FOR THE DISTRICT OF MASSACHUSETTS[ELSE IF Jurisdiction = "New Hampshire"]IN THE UNITED STATES DISTRICT COURT FOR THE DISTRICT OF NEW HAMPSHIRE[ELSE]IN THE UNITED STATES DISTRICT COURT FOR THE DISTRICT OF ________[END IF]</w:t>
+        <w:t xml:space="preserve">[IF Jurisdiction = "Massachusetts"]IN THE UNITED STATES DISTRICT COURT FOR THE DISTRICT OF MASSACHUSETTS[ELSE IF Jurisdiction = "New Hampshire"]IN THE UNITED STATES DISTRICT COURT FOR THE DISTRICT OF NEW HAMPSHIRE[ELSE]IN THE UNITED STATES DISTRICT COURT FOR THE DISTRICT OF </w:t>
+      </w:r>
+      <w:r>
+        <w:rPr>
+          <w:b/>
+          <w:bCs/>
+        </w:rPr>
+        <w:t>[JURISDICTION]</w:t>
+      </w:r>
+      <w:r>
+        <w:rPr>
+          <w:b/>
+          <w:bCs/>
+        </w:rPr>
+        <w:t>[END IF]</w:t>
       </w:r>
     </w:p>
     <w:p/>
@@ -1251,6 +1265,7 @@
   <w:style w:type="character" w:default="1" w:styleId="DefaultParagraphFont">
     <w:name w:val="Default Paragraph Font"/>
     <w:uiPriority w:val="1"/>
+    <w:semiHidden/>
     <w:unhideWhenUsed/>
   </w:style>
   <w:style w:type="table" w:default="1" w:styleId="TableNormal">

</xml_diff>

<commit_message>
Changed from Plaintiff to Petitoner and 4 fields for Petitioner name.  Updated cocumentationto match
</commit_message>
<xml_diff>
--- a/templates/petition.docx
+++ b/templates/petition.docx
@@ -87,7 +87,13 @@
           </w:tcPr>
           <w:p>
             <w:r>
-              <w:t>[PLAINTIFF NAME],</w:t>
+              <w:t>[</w:t>
+            </w:r>
+            <w:r>
+              <w:t>PETITIONER NAME</w:t>
+            </w:r>
+            <w:r>
+              <w:t>],</w:t>
             </w:r>
           </w:p>
         </w:tc>
@@ -118,7 +124,10 @@
           </w:tcPr>
           <w:p>
             <w:r>
-              <w:t>Plaintiff,</w:t>
+              <w:t>Petitioner</w:t>
+            </w:r>
+            <w:r>
+              <w:t>,</w:t>
             </w:r>
           </w:p>
         </w:tc>
@@ -218,7 +227,10 @@
           </w:tcPr>
           <w:p>
             <w:r>
-              <w:t>Defendant.</w:t>
+              <w:t>Respondent</w:t>
+            </w:r>
+            <w:r>
+              <w:t>.</w:t>
             </w:r>
           </w:p>
         </w:tc>
@@ -277,6 +289,7 @@
     <w:p/>
     <w:p>
       <w:pPr>
+        <w:jc w:val="center"/>
         <w:rPr>
           <w:b/>
           <w:bCs/>
@@ -287,7 +300,7 @@
           <w:b/>
           <w:bCs/>
         </w:rPr>
-        <w:t>COMPLAINT</w:t>
+        <w:t>PETITION FOR WRIT OF HABEAS CORPUS</w:t>
       </w:r>
     </w:p>
     <w:p/>
@@ -301,7 +314,16 @@
         <w:spacing w:after="240"/>
       </w:pPr>
       <w:r>
-        <w:t>Plaintiff, [Plaintiff Name], is an individual residing in [Jurisdiction].</w:t>
+        <w:t>Petitioner</w:t>
+      </w:r>
+      <w:r>
+        <w:t>, [</w:t>
+      </w:r>
+      <w:r>
+        <w:t>Petitioner Name</w:t>
+      </w:r>
+      <w:r>
+        <w:t>], is an individual residing in [Jurisdiction].</w:t>
       </w:r>
     </w:p>
     <w:p>
@@ -314,7 +336,10 @@
         <w:spacing w:after="240"/>
       </w:pPr>
       <w:r>
-        <w:t>Defendant is the [Defendant Name] and the warden in the Detention Facility in [Jurisdiction].</w:t>
+        <w:t>Respondent</w:t>
+      </w:r>
+      <w:r>
+        <w:t xml:space="preserve"> is the [Defendant Name] and the warden in the Detention Facility in [Jurisdiction].</w:t>
       </w:r>
     </w:p>
     <w:p>
@@ -347,8 +372,19 @@
         </w:numPr>
         <w:spacing w:after="240"/>
       </w:pPr>
-      <w:r>
-        <w:t>Plaintiff brings this action on behalf of all similarly situated parties as a GO Class proceeding.</w:t>
+      <w:proofErr w:type="gramStart"/>
+      <w:r>
+        <w:t>Petitioner</w:t>
+      </w:r>
+      <w:r>
+        <w:t xml:space="preserve"> </w:t>
+      </w:r>
+      <w:r>
+        <w:t>brings</w:t>
+      </w:r>
+      <w:proofErr w:type="gramEnd"/>
+      <w:r>
+        <w:t xml:space="preserve"> this action on behalf of all similarly situated parties as a GO Class proceeding.</w:t>
       </w:r>
     </w:p>
     <w:p>
@@ -369,7 +405,31 @@
         <w:spacing w:after="240"/>
       </w:pPr>
       <w:r>
-        <w:t>[IF Type of Habeas Petition = "GO Class"]Plaintiff seeks class-wide declaratory and injunctive relief on behalf of all class members.[ELSE]Plaintiff seeks individual habeas corpus relief and an immediate bond hearing.[END IF]</w:t>
+        <w:t>[IF Type of Habeas Petition = "GO Class"]</w:t>
+      </w:r>
+      <w:r>
+        <w:t xml:space="preserve"> </w:t>
+      </w:r>
+      <w:r>
+        <w:t>Petitioner</w:t>
+      </w:r>
+      <w:r>
+        <w:t xml:space="preserve"> </w:t>
+      </w:r>
+      <w:r>
+        <w:t>seeks class-wide declaratory and injunctive relief on behalf of all class members.[ELSE]</w:t>
+      </w:r>
+      <w:r>
+        <w:t xml:space="preserve"> </w:t>
+      </w:r>
+      <w:r>
+        <w:t>Petitioner</w:t>
+      </w:r>
+      <w:r>
+        <w:t xml:space="preserve"> </w:t>
+      </w:r>
+      <w:r>
+        <w:t>seeks individual habeas corpus relief and an immediate bond hearing.[END IF]</w:t>
       </w:r>
     </w:p>
     <w:p>

</xml_diff>

<commit_message>
Dynamic fields added after static fields at top of petition
</commit_message>
<xml_diff>
--- a/templates/petition.docx
+++ b/templates/petition.docx
@@ -372,7 +372,6 @@
         </w:numPr>
         <w:spacing w:after="240"/>
       </w:pPr>
-      <w:proofErr w:type="gramStart"/>
       <w:r>
         <w:t>Petitioner</w:t>
       </w:r>
@@ -380,11 +379,7 @@
         <w:t xml:space="preserve"> </w:t>
       </w:r>
       <w:r>
-        <w:t>brings</w:t>
-      </w:r>
-      <w:proofErr w:type="gramEnd"/>
-      <w:r>
-        <w:t xml:space="preserve"> this action on behalf of all similarly situated parties as a GO Class proceeding.</w:t>
+        <w:t>brings this action on behalf of all similarly situated parties as a GO Class proceeding.</w:t>
       </w:r>
     </w:p>
     <w:p>
@@ -430,6 +425,72 @@
       </w:r>
       <w:r>
         <w:t>seeks individual habeas corpus relief and an immediate bond hearing.[END IF]</w:t>
+      </w:r>
+    </w:p>
+    <w:p>
+      <w:pPr>
+        <w:pStyle w:val="ListParagraph"/>
+        <w:numPr>
+          <w:ilvl w:val="0"/>
+          <w:numId w:val="3"/>
+        </w:numPr>
+        <w:spacing w:after="240"/>
+      </w:pPr>
+      <w:r>
+        <w:t>Petitioner [Petitioner Name] is a citizen of [Country of Citizenship] and has been continuously present in the United States since [Continuous Residence Date].</w:t>
+      </w:r>
+    </w:p>
+    <w:p>
+      <w:pPr>
+        <w:pStyle w:val="ListParagraph"/>
+        <w:numPr>
+          <w:ilvl w:val="0"/>
+          <w:numId w:val="3"/>
+        </w:numPr>
+        <w:spacing w:after="240"/>
+      </w:pPr>
+      <w:r>
+        <w:t>2. Petitioner entered the United States without inspection on or about [Date of Entry] at or near [Entry Location].</w:t>
+      </w:r>
+    </w:p>
+    <w:p>
+      <w:pPr>
+        <w:pStyle w:val="ListParagraph"/>
+        <w:numPr>
+          <w:ilvl w:val="0"/>
+          <w:numId w:val="3"/>
+        </w:numPr>
+        <w:spacing w:after="240"/>
+      </w:pPr>
+      <w:r>
+        <w:lastRenderedPageBreak/>
+        <w:t>[NOTE TO PRACTITIONER: Include community ties, absence of criminal record, and family members.]</w:t>
+      </w:r>
+    </w:p>
+    <w:p>
+      <w:pPr>
+        <w:pStyle w:val="ListParagraph"/>
+        <w:numPr>
+          <w:ilvl w:val="0"/>
+          <w:numId w:val="3"/>
+        </w:numPr>
+        <w:spacing w:after="240"/>
+      </w:pPr>
+      <w:r>
+        <w:t>Petitioner was arrested in [Jurisdiction] by U.S. Immigration and Customs Enforcement on or about [Date of Arrest].</w:t>
+      </w:r>
+    </w:p>
+    <w:p>
+      <w:pPr>
+        <w:pStyle w:val="ListParagraph"/>
+        <w:numPr>
+          <w:ilvl w:val="0"/>
+          <w:numId w:val="3"/>
+        </w:numPr>
+        <w:spacing w:after="240"/>
+      </w:pPr>
+      <w:r>
+        <w:t>Petitioner is currently detained in the physical custody of Respondents at the [Detention Facility]. [He/She] [is/are] being held without an individualized bond hearing before an Immigration Judge, violating [Petitioner's] Fifth Amendment due process rights.</w:t>
       </w:r>
     </w:p>
     <w:p>

</xml_diff>